<commit_message>
Add percentage reversal threshold mode
</commit_message>
<xml_diff>
--- a/reports/continuity_wave_research_report.docx
+++ b/reports/continuity_wave_research_report.docx
@@ -16,7 +16,7 @@
         <w:jc w:val="center"/>
       </w:pPr>
       <w:r>
-        <w:t>生成时间：2026-06-09 09:58；数据目录：D:\trend_score\data</w:t>
+        <w:t>生成时间：2026-06-09 10:13；数据目录：D:\trend_score\data</w:t>
       </w:r>
     </w:p>
     <w:p>
@@ -40,7 +40,7 @@
         <w:pStyle w:val="ListBullet"/>
       </w:pPr>
       <w:r>
-        <w:t>当前自适应最小反转阈值的中位数为 89.49 点，单品种年化识别波段数中位数约 17.3 段；新增最小波段交易日过滤后，1-2 天噪声反转不再轻易进入主波段。</w:t>
+        <w:t>当前自适应反转阈值的中位数为 89.49 点，折算为价格比例约 3.28%，约等于 3.8 倍中位日波动；单品种年化识别波段数中位数约 17.3 段。</w:t>
       </w:r>
     </w:p>
     <w:p>
@@ -92,7 +92,7 @@
     </w:p>
     <w:p>
       <w:r>
-        <w:t>最小反转点数采用“手动优先、自适应兜底”的规则：用户在网页中输入大于 0 的值时使用手动阈值；输入 0 时，脚本基于 ATR、日收益波动和绝对日波动共同估计阈值。这个口径的意义，是让不同价格量级的品种先各自完成波段切分，再进入同品种、同方向、同级别的相对评分。</w:t>
+        <w:t>反转阈值支持三种口径：自动模式按 ATR、日收益波动和绝对日波动估算；百分比模式按价格比例判断反转，更适合跨资产理解；点数模式保留给熟悉单一品种的人工精调。报告中同时展示点数、折算百分比和相对日波动倍数，避免不同价格量级的品种被点数误导。</w:t>
       </w:r>
     </w:p>
     <w:p>
@@ -141,12 +141,12 @@
     </w:p>
     <w:p>
       <w:r>
-        <w:t>阈值与波段数量的相关系数为 -0.30。如果该值显著为负，说明阈值越高切分越少；如果接近 0，则更多由品种自身波动形态决定。当前年化波段最密集的是 沪深300（21.2 段/年），最平滑的是 黄金连续（8.3 段/年）。</w:t>
+        <w:t>折算百分比阈值与波段数量的相关系数为 -0.08。如果该值显著为负，说明阈值越高切分越少；如果接近 0，则更多由品种自身波动形态决定。当前年化波段最密集的是 沪深300（21.2 段/年），最平滑的是 黄金连续（8.3 段/年）。</w:t>
       </w:r>
     </w:p>
     <w:p>
       <w:r>
-        <w:t>这个结果用于判断识别是否过度切分：如果某品种波段数量高、平均持续天数短、但总收益和波动并不高，就需要提高阈值或增加最小持续天数；反过来，如果长期只有少量波段，系统可能过度平滑，容易漏掉中级别趋势。</w:t>
+        <w:t>这个结果用于判断识别是否过度切分：如果某品种波段数量高、平均持续天数短、但总收益和波动并不高，就需要提高百分比阈值或增加最小持续天数；反过来，如果长期只有少量波段，系统可能过度平滑，容易漏掉中级别趋势。</w:t>
       </w:r>
     </w:p>
     <w:p>
@@ -1663,7 +1663,7 @@
         <w:pStyle w:val="ListNumber"/>
       </w:pPr>
       <w:r>
-        <w:t>阈值仍是系统最敏感的入口。下一步可以把最小反转点数从“点数口径”扩展到“波动率归一口径”，让指数、板块、商品之间更可比。</w:t>
+        <w:t>阈值仍是系统最敏感的入口。本轮新增百分比口径后，下一步可以继续加入 ATR 倍数或历史波动分位，让指数、板块、商品之间更可比。</w:t>
       </w:r>
     </w:p>
     <w:p>
@@ -1726,24 +1726,26 @@
         <w:tblLook w:firstColumn="1" w:firstRow="1" w:lastColumn="0" w:lastRow="0" w:noHBand="0" w:noVBand="1" w:val="04A0"/>
       </w:tblPr>
       <w:tblGrid>
-        <w:gridCol w:w="665"/>
-        <w:gridCol w:w="665"/>
-        <w:gridCol w:w="665"/>
-        <w:gridCol w:w="665"/>
-        <w:gridCol w:w="665"/>
-        <w:gridCol w:w="665"/>
-        <w:gridCol w:w="665"/>
-        <w:gridCol w:w="665"/>
-        <w:gridCol w:w="665"/>
-        <w:gridCol w:w="665"/>
-        <w:gridCol w:w="665"/>
-        <w:gridCol w:w="665"/>
-        <w:gridCol w:w="665"/>
+        <w:gridCol w:w="576"/>
+        <w:gridCol w:w="576"/>
+        <w:gridCol w:w="576"/>
+        <w:gridCol w:w="576"/>
+        <w:gridCol w:w="576"/>
+        <w:gridCol w:w="576"/>
+        <w:gridCol w:w="576"/>
+        <w:gridCol w:w="576"/>
+        <w:gridCol w:w="576"/>
+        <w:gridCol w:w="576"/>
+        <w:gridCol w:w="576"/>
+        <w:gridCol w:w="576"/>
+        <w:gridCol w:w="576"/>
+        <w:gridCol w:w="576"/>
+        <w:gridCol w:w="576"/>
       </w:tblGrid>
       <w:tr>
         <w:tc>
           <w:tcPr>
-            <w:tcW w:type="dxa" w:w="665"/>
+            <w:tcW w:type="dxa" w:w="576"/>
           </w:tcPr>
           <w:p>
             <w:r>
@@ -1753,7 +1755,7 @@
         </w:tc>
         <w:tc>
           <w:tcPr>
-            <w:tcW w:type="dxa" w:w="665"/>
+            <w:tcW w:type="dxa" w:w="576"/>
           </w:tcPr>
           <w:p>
             <w:r>
@@ -1763,7 +1765,7 @@
         </w:tc>
         <w:tc>
           <w:tcPr>
-            <w:tcW w:type="dxa" w:w="665"/>
+            <w:tcW w:type="dxa" w:w="576"/>
           </w:tcPr>
           <w:p>
             <w:r>
@@ -1773,7 +1775,7 @@
         </w:tc>
         <w:tc>
           <w:tcPr>
-            <w:tcW w:type="dxa" w:w="665"/>
+            <w:tcW w:type="dxa" w:w="576"/>
           </w:tcPr>
           <w:p>
             <w:r>
@@ -1783,7 +1785,7 @@
         </w:tc>
         <w:tc>
           <w:tcPr>
-            <w:tcW w:type="dxa" w:w="665"/>
+            <w:tcW w:type="dxa" w:w="576"/>
           </w:tcPr>
           <w:p>
             <w:r>
@@ -1793,7 +1795,7 @@
         </w:tc>
         <w:tc>
           <w:tcPr>
-            <w:tcW w:type="dxa" w:w="665"/>
+            <w:tcW w:type="dxa" w:w="576"/>
           </w:tcPr>
           <w:p>
             <w:r>
@@ -1803,7 +1805,7 @@
         </w:tc>
         <w:tc>
           <w:tcPr>
-            <w:tcW w:type="dxa" w:w="665"/>
+            <w:tcW w:type="dxa" w:w="576"/>
           </w:tcPr>
           <w:p>
             <w:r>
@@ -1813,7 +1815,7 @@
         </w:tc>
         <w:tc>
           <w:tcPr>
-            <w:tcW w:type="dxa" w:w="665"/>
+            <w:tcW w:type="dxa" w:w="576"/>
           </w:tcPr>
           <w:p>
             <w:r>
@@ -1823,7 +1825,7 @@
         </w:tc>
         <w:tc>
           <w:tcPr>
-            <w:tcW w:type="dxa" w:w="665"/>
+            <w:tcW w:type="dxa" w:w="576"/>
           </w:tcPr>
           <w:p>
             <w:r>
@@ -1833,7 +1835,27 @@
         </w:tc>
         <w:tc>
           <w:tcPr>
-            <w:tcW w:type="dxa" w:w="665"/>
+            <w:tcW w:type="dxa" w:w="576"/>
+          </w:tcPr>
+          <w:p>
+            <w:r>
+              <w:t>反转比例(%)</w:t>
+            </w:r>
+          </w:p>
+        </w:tc>
+        <w:tc>
+          <w:tcPr>
+            <w:tcW w:type="dxa" w:w="576"/>
+          </w:tcPr>
+          <w:p>
+            <w:r>
+              <w:t>日波动倍数</w:t>
+            </w:r>
+          </w:p>
+        </w:tc>
+        <w:tc>
+          <w:tcPr>
+            <w:tcW w:type="dxa" w:w="576"/>
           </w:tcPr>
           <w:p>
             <w:r>
@@ -1843,7 +1865,7 @@
         </w:tc>
         <w:tc>
           <w:tcPr>
-            <w:tcW w:type="dxa" w:w="665"/>
+            <w:tcW w:type="dxa" w:w="576"/>
           </w:tcPr>
           <w:p>
             <w:r>
@@ -1853,7 +1875,7 @@
         </w:tc>
         <w:tc>
           <w:tcPr>
-            <w:tcW w:type="dxa" w:w="665"/>
+            <w:tcW w:type="dxa" w:w="576"/>
           </w:tcPr>
           <w:p>
             <w:r>
@@ -1863,7 +1885,7 @@
         </w:tc>
         <w:tc>
           <w:tcPr>
-            <w:tcW w:type="dxa" w:w="665"/>
+            <w:tcW w:type="dxa" w:w="576"/>
           </w:tcPr>
           <w:p>
             <w:r>
@@ -1875,7 +1897,7 @@
       <w:tr>
         <w:tc>
           <w:tcPr>
-            <w:tcW w:type="dxa" w:w="665"/>
+            <w:tcW w:type="dxa" w:w="576"/>
           </w:tcPr>
           <w:p>
             <w:r>
@@ -1885,7 +1907,7 @@
         </w:tc>
         <w:tc>
           <w:tcPr>
-            <w:tcW w:type="dxa" w:w="665"/>
+            <w:tcW w:type="dxa" w:w="576"/>
           </w:tcPr>
           <w:p>
             <w:r>
@@ -1895,7 +1917,7 @@
         </w:tc>
         <w:tc>
           <w:tcPr>
-            <w:tcW w:type="dxa" w:w="665"/>
+            <w:tcW w:type="dxa" w:w="576"/>
           </w:tcPr>
           <w:p>
             <w:r>
@@ -1905,7 +1927,7 @@
         </w:tc>
         <w:tc>
           <w:tcPr>
-            <w:tcW w:type="dxa" w:w="665"/>
+            <w:tcW w:type="dxa" w:w="576"/>
           </w:tcPr>
           <w:p>
             <w:r>
@@ -1915,7 +1937,7 @@
         </w:tc>
         <w:tc>
           <w:tcPr>
-            <w:tcW w:type="dxa" w:w="665"/>
+            <w:tcW w:type="dxa" w:w="576"/>
           </w:tcPr>
           <w:p>
             <w:r>
@@ -1925,7 +1947,7 @@
         </w:tc>
         <w:tc>
           <w:tcPr>
-            <w:tcW w:type="dxa" w:w="665"/>
+            <w:tcW w:type="dxa" w:w="576"/>
           </w:tcPr>
           <w:p>
             <w:r>
@@ -1935,7 +1957,7 @@
         </w:tc>
         <w:tc>
           <w:tcPr>
-            <w:tcW w:type="dxa" w:w="665"/>
+            <w:tcW w:type="dxa" w:w="576"/>
           </w:tcPr>
           <w:p>
             <w:r>
@@ -1945,7 +1967,7 @@
         </w:tc>
         <w:tc>
           <w:tcPr>
-            <w:tcW w:type="dxa" w:w="665"/>
+            <w:tcW w:type="dxa" w:w="576"/>
           </w:tcPr>
           <w:p>
             <w:r>
@@ -1955,7 +1977,7 @@
         </w:tc>
         <w:tc>
           <w:tcPr>
-            <w:tcW w:type="dxa" w:w="665"/>
+            <w:tcW w:type="dxa" w:w="576"/>
           </w:tcPr>
           <w:p>
             <w:r>
@@ -1965,7 +1987,27 @@
         </w:tc>
         <w:tc>
           <w:tcPr>
-            <w:tcW w:type="dxa" w:w="665"/>
+            <w:tcW w:type="dxa" w:w="576"/>
+          </w:tcPr>
+          <w:p>
+            <w:r>
+              <w:t>2.08</w:t>
+            </w:r>
+          </w:p>
+        </w:tc>
+        <w:tc>
+          <w:tcPr>
+            <w:tcW w:type="dxa" w:w="576"/>
+          </w:tcPr>
+          <w:p>
+            <w:r>
+              <w:t>3.94</w:t>
+            </w:r>
+          </w:p>
+        </w:tc>
+        <w:tc>
+          <w:tcPr>
+            <w:tcW w:type="dxa" w:w="576"/>
           </w:tcPr>
           <w:p>
             <w:r>
@@ -1975,7 +2017,7 @@
         </w:tc>
         <w:tc>
           <w:tcPr>
-            <w:tcW w:type="dxa" w:w="665"/>
+            <w:tcW w:type="dxa" w:w="576"/>
           </w:tcPr>
           <w:p>
             <w:r>
@@ -1985,7 +2027,7 @@
         </w:tc>
         <w:tc>
           <w:tcPr>
-            <w:tcW w:type="dxa" w:w="665"/>
+            <w:tcW w:type="dxa" w:w="576"/>
           </w:tcPr>
           <w:p>
             <w:r>
@@ -1995,7 +2037,7 @@
         </w:tc>
         <w:tc>
           <w:tcPr>
-            <w:tcW w:type="dxa" w:w="665"/>
+            <w:tcW w:type="dxa" w:w="576"/>
           </w:tcPr>
           <w:p>
             <w:r>
@@ -2007,7 +2049,7 @@
       <w:tr>
         <w:tc>
           <w:tcPr>
-            <w:tcW w:type="dxa" w:w="665"/>
+            <w:tcW w:type="dxa" w:w="576"/>
           </w:tcPr>
           <w:p>
             <w:r>
@@ -2017,7 +2059,7 @@
         </w:tc>
         <w:tc>
           <w:tcPr>
-            <w:tcW w:type="dxa" w:w="665"/>
+            <w:tcW w:type="dxa" w:w="576"/>
           </w:tcPr>
           <w:p>
             <w:r>
@@ -2027,7 +2069,7 @@
         </w:tc>
         <w:tc>
           <w:tcPr>
-            <w:tcW w:type="dxa" w:w="665"/>
+            <w:tcW w:type="dxa" w:w="576"/>
           </w:tcPr>
           <w:p>
             <w:r>
@@ -2037,7 +2079,7 @@
         </w:tc>
         <w:tc>
           <w:tcPr>
-            <w:tcW w:type="dxa" w:w="665"/>
+            <w:tcW w:type="dxa" w:w="576"/>
           </w:tcPr>
           <w:p>
             <w:r>
@@ -2047,7 +2089,7 @@
         </w:tc>
         <w:tc>
           <w:tcPr>
-            <w:tcW w:type="dxa" w:w="665"/>
+            <w:tcW w:type="dxa" w:w="576"/>
           </w:tcPr>
           <w:p>
             <w:r>
@@ -2057,7 +2099,7 @@
         </w:tc>
         <w:tc>
           <w:tcPr>
-            <w:tcW w:type="dxa" w:w="665"/>
+            <w:tcW w:type="dxa" w:w="576"/>
           </w:tcPr>
           <w:p>
             <w:r>
@@ -2067,7 +2109,7 @@
         </w:tc>
         <w:tc>
           <w:tcPr>
-            <w:tcW w:type="dxa" w:w="665"/>
+            <w:tcW w:type="dxa" w:w="576"/>
           </w:tcPr>
           <w:p>
             <w:r>
@@ -2077,7 +2119,7 @@
         </w:tc>
         <w:tc>
           <w:tcPr>
-            <w:tcW w:type="dxa" w:w="665"/>
+            <w:tcW w:type="dxa" w:w="576"/>
           </w:tcPr>
           <w:p>
             <w:r>
@@ -2087,7 +2129,7 @@
         </w:tc>
         <w:tc>
           <w:tcPr>
-            <w:tcW w:type="dxa" w:w="665"/>
+            <w:tcW w:type="dxa" w:w="576"/>
           </w:tcPr>
           <w:p>
             <w:r>
@@ -2097,7 +2139,27 @@
         </w:tc>
         <w:tc>
           <w:tcPr>
-            <w:tcW w:type="dxa" w:w="665"/>
+            <w:tcW w:type="dxa" w:w="576"/>
+          </w:tcPr>
+          <w:p>
+            <w:r>
+              <w:t>2.36</w:t>
+            </w:r>
+          </w:p>
+        </w:tc>
+        <w:tc>
+          <w:tcPr>
+            <w:tcW w:type="dxa" w:w="576"/>
+          </w:tcPr>
+          <w:p>
+            <w:r>
+              <w:t>3.75</w:t>
+            </w:r>
+          </w:p>
+        </w:tc>
+        <w:tc>
+          <w:tcPr>
+            <w:tcW w:type="dxa" w:w="576"/>
           </w:tcPr>
           <w:p>
             <w:r>
@@ -2107,7 +2169,7 @@
         </w:tc>
         <w:tc>
           <w:tcPr>
-            <w:tcW w:type="dxa" w:w="665"/>
+            <w:tcW w:type="dxa" w:w="576"/>
           </w:tcPr>
           <w:p>
             <w:r>
@@ -2117,7 +2179,7 @@
         </w:tc>
         <w:tc>
           <w:tcPr>
-            <w:tcW w:type="dxa" w:w="665"/>
+            <w:tcW w:type="dxa" w:w="576"/>
           </w:tcPr>
           <w:p>
             <w:r>
@@ -2127,7 +2189,7 @@
         </w:tc>
         <w:tc>
           <w:tcPr>
-            <w:tcW w:type="dxa" w:w="665"/>
+            <w:tcW w:type="dxa" w:w="576"/>
           </w:tcPr>
           <w:p>
             <w:r>
@@ -2139,7 +2201,7 @@
       <w:tr>
         <w:tc>
           <w:tcPr>
-            <w:tcW w:type="dxa" w:w="665"/>
+            <w:tcW w:type="dxa" w:w="576"/>
           </w:tcPr>
           <w:p>
             <w:r>
@@ -2149,7 +2211,7 @@
         </w:tc>
         <w:tc>
           <w:tcPr>
-            <w:tcW w:type="dxa" w:w="665"/>
+            <w:tcW w:type="dxa" w:w="576"/>
           </w:tcPr>
           <w:p>
             <w:r>
@@ -2159,7 +2221,7 @@
         </w:tc>
         <w:tc>
           <w:tcPr>
-            <w:tcW w:type="dxa" w:w="665"/>
+            <w:tcW w:type="dxa" w:w="576"/>
           </w:tcPr>
           <w:p>
             <w:r>
@@ -2169,7 +2231,7 @@
         </w:tc>
         <w:tc>
           <w:tcPr>
-            <w:tcW w:type="dxa" w:w="665"/>
+            <w:tcW w:type="dxa" w:w="576"/>
           </w:tcPr>
           <w:p>
             <w:r>
@@ -2179,7 +2241,7 @@
         </w:tc>
         <w:tc>
           <w:tcPr>
-            <w:tcW w:type="dxa" w:w="665"/>
+            <w:tcW w:type="dxa" w:w="576"/>
           </w:tcPr>
           <w:p>
             <w:r>
@@ -2189,7 +2251,7 @@
         </w:tc>
         <w:tc>
           <w:tcPr>
-            <w:tcW w:type="dxa" w:w="665"/>
+            <w:tcW w:type="dxa" w:w="576"/>
           </w:tcPr>
           <w:p>
             <w:r>
@@ -2199,7 +2261,7 @@
         </w:tc>
         <w:tc>
           <w:tcPr>
-            <w:tcW w:type="dxa" w:w="665"/>
+            <w:tcW w:type="dxa" w:w="576"/>
           </w:tcPr>
           <w:p>
             <w:r>
@@ -2209,7 +2271,7 @@
         </w:tc>
         <w:tc>
           <w:tcPr>
-            <w:tcW w:type="dxa" w:w="665"/>
+            <w:tcW w:type="dxa" w:w="576"/>
           </w:tcPr>
           <w:p>
             <w:r>
@@ -2219,7 +2281,7 @@
         </w:tc>
         <w:tc>
           <w:tcPr>
-            <w:tcW w:type="dxa" w:w="665"/>
+            <w:tcW w:type="dxa" w:w="576"/>
           </w:tcPr>
           <w:p>
             <w:r>
@@ -2229,7 +2291,27 @@
         </w:tc>
         <w:tc>
           <w:tcPr>
-            <w:tcW w:type="dxa" w:w="665"/>
+            <w:tcW w:type="dxa" w:w="576"/>
+          </w:tcPr>
+          <w:p>
+            <w:r>
+              <w:t>4.12</w:t>
+            </w:r>
+          </w:p>
+        </w:tc>
+        <w:tc>
+          <w:tcPr>
+            <w:tcW w:type="dxa" w:w="576"/>
+          </w:tcPr>
+          <w:p>
+            <w:r>
+              <w:t>3.81</w:t>
+            </w:r>
+          </w:p>
+        </w:tc>
+        <w:tc>
+          <w:tcPr>
+            <w:tcW w:type="dxa" w:w="576"/>
           </w:tcPr>
           <w:p>
             <w:r>
@@ -2239,7 +2321,7 @@
         </w:tc>
         <w:tc>
           <w:tcPr>
-            <w:tcW w:type="dxa" w:w="665"/>
+            <w:tcW w:type="dxa" w:w="576"/>
           </w:tcPr>
           <w:p>
             <w:r>
@@ -2249,7 +2331,7 @@
         </w:tc>
         <w:tc>
           <w:tcPr>
-            <w:tcW w:type="dxa" w:w="665"/>
+            <w:tcW w:type="dxa" w:w="576"/>
           </w:tcPr>
           <w:p>
             <w:r>
@@ -2259,7 +2341,7 @@
         </w:tc>
         <w:tc>
           <w:tcPr>
-            <w:tcW w:type="dxa" w:w="665"/>
+            <w:tcW w:type="dxa" w:w="576"/>
           </w:tcPr>
           <w:p>
             <w:r>
@@ -2271,7 +2353,7 @@
       <w:tr>
         <w:tc>
           <w:tcPr>
-            <w:tcW w:type="dxa" w:w="665"/>
+            <w:tcW w:type="dxa" w:w="576"/>
           </w:tcPr>
           <w:p>
             <w:r>
@@ -2281,7 +2363,7 @@
         </w:tc>
         <w:tc>
           <w:tcPr>
-            <w:tcW w:type="dxa" w:w="665"/>
+            <w:tcW w:type="dxa" w:w="576"/>
           </w:tcPr>
           <w:p>
             <w:r>
@@ -2291,7 +2373,7 @@
         </w:tc>
         <w:tc>
           <w:tcPr>
-            <w:tcW w:type="dxa" w:w="665"/>
+            <w:tcW w:type="dxa" w:w="576"/>
           </w:tcPr>
           <w:p>
             <w:r>
@@ -2301,7 +2383,7 @@
         </w:tc>
         <w:tc>
           <w:tcPr>
-            <w:tcW w:type="dxa" w:w="665"/>
+            <w:tcW w:type="dxa" w:w="576"/>
           </w:tcPr>
           <w:p>
             <w:r>
@@ -2311,7 +2393,7 @@
         </w:tc>
         <w:tc>
           <w:tcPr>
-            <w:tcW w:type="dxa" w:w="665"/>
+            <w:tcW w:type="dxa" w:w="576"/>
           </w:tcPr>
           <w:p>
             <w:r>
@@ -2321,7 +2403,7 @@
         </w:tc>
         <w:tc>
           <w:tcPr>
-            <w:tcW w:type="dxa" w:w="665"/>
+            <w:tcW w:type="dxa" w:w="576"/>
           </w:tcPr>
           <w:p>
             <w:r>
@@ -2331,7 +2413,7 @@
         </w:tc>
         <w:tc>
           <w:tcPr>
-            <w:tcW w:type="dxa" w:w="665"/>
+            <w:tcW w:type="dxa" w:w="576"/>
           </w:tcPr>
           <w:p>
             <w:r>
@@ -2341,7 +2423,7 @@
         </w:tc>
         <w:tc>
           <w:tcPr>
-            <w:tcW w:type="dxa" w:w="665"/>
+            <w:tcW w:type="dxa" w:w="576"/>
           </w:tcPr>
           <w:p>
             <w:r>
@@ -2351,7 +2433,7 @@
         </w:tc>
         <w:tc>
           <w:tcPr>
-            <w:tcW w:type="dxa" w:w="665"/>
+            <w:tcW w:type="dxa" w:w="576"/>
           </w:tcPr>
           <w:p>
             <w:r>
@@ -2361,7 +2443,27 @@
         </w:tc>
         <w:tc>
           <w:tcPr>
-            <w:tcW w:type="dxa" w:w="665"/>
+            <w:tcW w:type="dxa" w:w="576"/>
+          </w:tcPr>
+          <w:p>
+            <w:r>
+              <w:t>3.09</w:t>
+            </w:r>
+          </w:p>
+        </w:tc>
+        <w:tc>
+          <w:tcPr>
+            <w:tcW w:type="dxa" w:w="576"/>
+          </w:tcPr>
+          <w:p>
+            <w:r>
+              <w:t>3.71</w:t>
+            </w:r>
+          </w:p>
+        </w:tc>
+        <w:tc>
+          <w:tcPr>
+            <w:tcW w:type="dxa" w:w="576"/>
           </w:tcPr>
           <w:p>
             <w:r>
@@ -2371,7 +2473,7 @@
         </w:tc>
         <w:tc>
           <w:tcPr>
-            <w:tcW w:type="dxa" w:w="665"/>
+            <w:tcW w:type="dxa" w:w="576"/>
           </w:tcPr>
           <w:p>
             <w:r>
@@ -2381,7 +2483,7 @@
         </w:tc>
         <w:tc>
           <w:tcPr>
-            <w:tcW w:type="dxa" w:w="665"/>
+            <w:tcW w:type="dxa" w:w="576"/>
           </w:tcPr>
           <w:p>
             <w:r>
@@ -2391,7 +2493,7 @@
         </w:tc>
         <w:tc>
           <w:tcPr>
-            <w:tcW w:type="dxa" w:w="665"/>
+            <w:tcW w:type="dxa" w:w="576"/>
           </w:tcPr>
           <w:p>
             <w:r>
@@ -2403,7 +2505,7 @@
       <w:tr>
         <w:tc>
           <w:tcPr>
-            <w:tcW w:type="dxa" w:w="665"/>
+            <w:tcW w:type="dxa" w:w="576"/>
           </w:tcPr>
           <w:p>
             <w:r>
@@ -2413,7 +2515,7 @@
         </w:tc>
         <w:tc>
           <w:tcPr>
-            <w:tcW w:type="dxa" w:w="665"/>
+            <w:tcW w:type="dxa" w:w="576"/>
           </w:tcPr>
           <w:p>
             <w:r>
@@ -2423,7 +2525,7 @@
         </w:tc>
         <w:tc>
           <w:tcPr>
-            <w:tcW w:type="dxa" w:w="665"/>
+            <w:tcW w:type="dxa" w:w="576"/>
           </w:tcPr>
           <w:p>
             <w:r>
@@ -2433,7 +2535,7 @@
         </w:tc>
         <w:tc>
           <w:tcPr>
-            <w:tcW w:type="dxa" w:w="665"/>
+            <w:tcW w:type="dxa" w:w="576"/>
           </w:tcPr>
           <w:p>
             <w:r>
@@ -2443,7 +2545,7 @@
         </w:tc>
         <w:tc>
           <w:tcPr>
-            <w:tcW w:type="dxa" w:w="665"/>
+            <w:tcW w:type="dxa" w:w="576"/>
           </w:tcPr>
           <w:p>
             <w:r>
@@ -2453,7 +2555,7 @@
         </w:tc>
         <w:tc>
           <w:tcPr>
-            <w:tcW w:type="dxa" w:w="665"/>
+            <w:tcW w:type="dxa" w:w="576"/>
           </w:tcPr>
           <w:p>
             <w:r>
@@ -2463,7 +2565,7 @@
         </w:tc>
         <w:tc>
           <w:tcPr>
-            <w:tcW w:type="dxa" w:w="665"/>
+            <w:tcW w:type="dxa" w:w="576"/>
           </w:tcPr>
           <w:p>
             <w:r>
@@ -2473,7 +2575,7 @@
         </w:tc>
         <w:tc>
           <w:tcPr>
-            <w:tcW w:type="dxa" w:w="665"/>
+            <w:tcW w:type="dxa" w:w="576"/>
           </w:tcPr>
           <w:p>
             <w:r>
@@ -2483,7 +2585,7 @@
         </w:tc>
         <w:tc>
           <w:tcPr>
-            <w:tcW w:type="dxa" w:w="665"/>
+            <w:tcW w:type="dxa" w:w="576"/>
           </w:tcPr>
           <w:p>
             <w:r>
@@ -2493,7 +2595,27 @@
         </w:tc>
         <w:tc>
           <w:tcPr>
-            <w:tcW w:type="dxa" w:w="665"/>
+            <w:tcW w:type="dxa" w:w="576"/>
+          </w:tcPr>
+          <w:p>
+            <w:r>
+              <w:t>3.72</w:t>
+            </w:r>
+          </w:p>
+        </w:tc>
+        <w:tc>
+          <w:tcPr>
+            <w:tcW w:type="dxa" w:w="576"/>
+          </w:tcPr>
+          <w:p>
+            <w:r>
+              <w:t>3.64</w:t>
+            </w:r>
+          </w:p>
+        </w:tc>
+        <w:tc>
+          <w:tcPr>
+            <w:tcW w:type="dxa" w:w="576"/>
           </w:tcPr>
           <w:p>
             <w:r>
@@ -2503,7 +2625,7 @@
         </w:tc>
         <w:tc>
           <w:tcPr>
-            <w:tcW w:type="dxa" w:w="665"/>
+            <w:tcW w:type="dxa" w:w="576"/>
           </w:tcPr>
           <w:p>
             <w:r>
@@ -2513,7 +2635,7 @@
         </w:tc>
         <w:tc>
           <w:tcPr>
-            <w:tcW w:type="dxa" w:w="665"/>
+            <w:tcW w:type="dxa" w:w="576"/>
           </w:tcPr>
           <w:p>
             <w:r>
@@ -2523,7 +2645,7 @@
         </w:tc>
         <w:tc>
           <w:tcPr>
-            <w:tcW w:type="dxa" w:w="665"/>
+            <w:tcW w:type="dxa" w:w="576"/>
           </w:tcPr>
           <w:p>
             <w:r>
@@ -2535,7 +2657,7 @@
       <w:tr>
         <w:tc>
           <w:tcPr>
-            <w:tcW w:type="dxa" w:w="665"/>
+            <w:tcW w:type="dxa" w:w="576"/>
           </w:tcPr>
           <w:p>
             <w:r>
@@ -2545,7 +2667,7 @@
         </w:tc>
         <w:tc>
           <w:tcPr>
-            <w:tcW w:type="dxa" w:w="665"/>
+            <w:tcW w:type="dxa" w:w="576"/>
           </w:tcPr>
           <w:p>
             <w:r>
@@ -2555,7 +2677,7 @@
         </w:tc>
         <w:tc>
           <w:tcPr>
-            <w:tcW w:type="dxa" w:w="665"/>
+            <w:tcW w:type="dxa" w:w="576"/>
           </w:tcPr>
           <w:p>
             <w:r>
@@ -2565,7 +2687,7 @@
         </w:tc>
         <w:tc>
           <w:tcPr>
-            <w:tcW w:type="dxa" w:w="665"/>
+            <w:tcW w:type="dxa" w:w="576"/>
           </w:tcPr>
           <w:p>
             <w:r>
@@ -2575,7 +2697,7 @@
         </w:tc>
         <w:tc>
           <w:tcPr>
-            <w:tcW w:type="dxa" w:w="665"/>
+            <w:tcW w:type="dxa" w:w="576"/>
           </w:tcPr>
           <w:p>
             <w:r>
@@ -2585,7 +2707,7 @@
         </w:tc>
         <w:tc>
           <w:tcPr>
-            <w:tcW w:type="dxa" w:w="665"/>
+            <w:tcW w:type="dxa" w:w="576"/>
           </w:tcPr>
           <w:p>
             <w:r>
@@ -2595,7 +2717,7 @@
         </w:tc>
         <w:tc>
           <w:tcPr>
-            <w:tcW w:type="dxa" w:w="665"/>
+            <w:tcW w:type="dxa" w:w="576"/>
           </w:tcPr>
           <w:p>
             <w:r>
@@ -2605,7 +2727,7 @@
         </w:tc>
         <w:tc>
           <w:tcPr>
-            <w:tcW w:type="dxa" w:w="665"/>
+            <w:tcW w:type="dxa" w:w="576"/>
           </w:tcPr>
           <w:p>
             <w:r>
@@ -2615,7 +2737,7 @@
         </w:tc>
         <w:tc>
           <w:tcPr>
-            <w:tcW w:type="dxa" w:w="665"/>
+            <w:tcW w:type="dxa" w:w="576"/>
           </w:tcPr>
           <w:p>
             <w:r>
@@ -2625,7 +2747,27 @@
         </w:tc>
         <w:tc>
           <w:tcPr>
-            <w:tcW w:type="dxa" w:w="665"/>
+            <w:tcW w:type="dxa" w:w="576"/>
+          </w:tcPr>
+          <w:p>
+            <w:r>
+              <w:t>5.42</w:t>
+            </w:r>
+          </w:p>
+        </w:tc>
+        <w:tc>
+          <w:tcPr>
+            <w:tcW w:type="dxa" w:w="576"/>
+          </w:tcPr>
+          <w:p>
+            <w:r>
+              <w:t>3.11</w:t>
+            </w:r>
+          </w:p>
+        </w:tc>
+        <w:tc>
+          <w:tcPr>
+            <w:tcW w:type="dxa" w:w="576"/>
           </w:tcPr>
           <w:p>
             <w:r>
@@ -2635,7 +2777,7 @@
         </w:tc>
         <w:tc>
           <w:tcPr>
-            <w:tcW w:type="dxa" w:w="665"/>
+            <w:tcW w:type="dxa" w:w="576"/>
           </w:tcPr>
           <w:p>
             <w:r>
@@ -2645,7 +2787,7 @@
         </w:tc>
         <w:tc>
           <w:tcPr>
-            <w:tcW w:type="dxa" w:w="665"/>
+            <w:tcW w:type="dxa" w:w="576"/>
           </w:tcPr>
           <w:p>
             <w:r>
@@ -2655,7 +2797,7 @@
         </w:tc>
         <w:tc>
           <w:tcPr>
-            <w:tcW w:type="dxa" w:w="665"/>
+            <w:tcW w:type="dxa" w:w="576"/>
           </w:tcPr>
           <w:p>
             <w:r>
@@ -2667,7 +2809,7 @@
       <w:tr>
         <w:tc>
           <w:tcPr>
-            <w:tcW w:type="dxa" w:w="665"/>
+            <w:tcW w:type="dxa" w:w="576"/>
           </w:tcPr>
           <w:p>
             <w:r>
@@ -2677,7 +2819,7 @@
         </w:tc>
         <w:tc>
           <w:tcPr>
-            <w:tcW w:type="dxa" w:w="665"/>
+            <w:tcW w:type="dxa" w:w="576"/>
           </w:tcPr>
           <w:p>
             <w:r>
@@ -2687,7 +2829,7 @@
         </w:tc>
         <w:tc>
           <w:tcPr>
-            <w:tcW w:type="dxa" w:w="665"/>
+            <w:tcW w:type="dxa" w:w="576"/>
           </w:tcPr>
           <w:p>
             <w:r>
@@ -2697,7 +2839,7 @@
         </w:tc>
         <w:tc>
           <w:tcPr>
-            <w:tcW w:type="dxa" w:w="665"/>
+            <w:tcW w:type="dxa" w:w="576"/>
           </w:tcPr>
           <w:p>
             <w:r>
@@ -2707,7 +2849,7 @@
         </w:tc>
         <w:tc>
           <w:tcPr>
-            <w:tcW w:type="dxa" w:w="665"/>
+            <w:tcW w:type="dxa" w:w="576"/>
           </w:tcPr>
           <w:p>
             <w:r>
@@ -2717,7 +2859,7 @@
         </w:tc>
         <w:tc>
           <w:tcPr>
-            <w:tcW w:type="dxa" w:w="665"/>
+            <w:tcW w:type="dxa" w:w="576"/>
           </w:tcPr>
           <w:p>
             <w:r>
@@ -2727,7 +2869,7 @@
         </w:tc>
         <w:tc>
           <w:tcPr>
-            <w:tcW w:type="dxa" w:w="665"/>
+            <w:tcW w:type="dxa" w:w="576"/>
           </w:tcPr>
           <w:p>
             <w:r>
@@ -2737,7 +2879,7 @@
         </w:tc>
         <w:tc>
           <w:tcPr>
-            <w:tcW w:type="dxa" w:w="665"/>
+            <w:tcW w:type="dxa" w:w="576"/>
           </w:tcPr>
           <w:p>
             <w:r>
@@ -2747,7 +2889,7 @@
         </w:tc>
         <w:tc>
           <w:tcPr>
-            <w:tcW w:type="dxa" w:w="665"/>
+            <w:tcW w:type="dxa" w:w="576"/>
           </w:tcPr>
           <w:p>
             <w:r>
@@ -2757,7 +2899,27 @@
         </w:tc>
         <w:tc>
           <w:tcPr>
-            <w:tcW w:type="dxa" w:w="665"/>
+            <w:tcW w:type="dxa" w:w="576"/>
+          </w:tcPr>
+          <w:p>
+            <w:r>
+              <w:t>3.26</w:t>
+            </w:r>
+          </w:p>
+        </w:tc>
+        <w:tc>
+          <w:tcPr>
+            <w:tcW w:type="dxa" w:w="576"/>
+          </w:tcPr>
+          <w:p>
+            <w:r>
+              <w:t>3.81</w:t>
+            </w:r>
+          </w:p>
+        </w:tc>
+        <w:tc>
+          <w:tcPr>
+            <w:tcW w:type="dxa" w:w="576"/>
           </w:tcPr>
           <w:p>
             <w:r>
@@ -2767,7 +2929,7 @@
         </w:tc>
         <w:tc>
           <w:tcPr>
-            <w:tcW w:type="dxa" w:w="665"/>
+            <w:tcW w:type="dxa" w:w="576"/>
           </w:tcPr>
           <w:p>
             <w:r>
@@ -2777,7 +2939,7 @@
         </w:tc>
         <w:tc>
           <w:tcPr>
-            <w:tcW w:type="dxa" w:w="665"/>
+            <w:tcW w:type="dxa" w:w="576"/>
           </w:tcPr>
           <w:p>
             <w:r>
@@ -2787,7 +2949,7 @@
         </w:tc>
         <w:tc>
           <w:tcPr>
-            <w:tcW w:type="dxa" w:w="665"/>
+            <w:tcW w:type="dxa" w:w="576"/>
           </w:tcPr>
           <w:p>
             <w:r>
@@ -2799,7 +2961,7 @@
       <w:tr>
         <w:tc>
           <w:tcPr>
-            <w:tcW w:type="dxa" w:w="665"/>
+            <w:tcW w:type="dxa" w:w="576"/>
           </w:tcPr>
           <w:p>
             <w:r>
@@ -2809,7 +2971,7 @@
         </w:tc>
         <w:tc>
           <w:tcPr>
-            <w:tcW w:type="dxa" w:w="665"/>
+            <w:tcW w:type="dxa" w:w="576"/>
           </w:tcPr>
           <w:p>
             <w:r>
@@ -2819,7 +2981,7 @@
         </w:tc>
         <w:tc>
           <w:tcPr>
-            <w:tcW w:type="dxa" w:w="665"/>
+            <w:tcW w:type="dxa" w:w="576"/>
           </w:tcPr>
           <w:p>
             <w:r>
@@ -2829,7 +2991,7 @@
         </w:tc>
         <w:tc>
           <w:tcPr>
-            <w:tcW w:type="dxa" w:w="665"/>
+            <w:tcW w:type="dxa" w:w="576"/>
           </w:tcPr>
           <w:p>
             <w:r>
@@ -2839,7 +3001,7 @@
         </w:tc>
         <w:tc>
           <w:tcPr>
-            <w:tcW w:type="dxa" w:w="665"/>
+            <w:tcW w:type="dxa" w:w="576"/>
           </w:tcPr>
           <w:p>
             <w:r>
@@ -2849,7 +3011,7 @@
         </w:tc>
         <w:tc>
           <w:tcPr>
-            <w:tcW w:type="dxa" w:w="665"/>
+            <w:tcW w:type="dxa" w:w="576"/>
           </w:tcPr>
           <w:p>
             <w:r>
@@ -2859,7 +3021,7 @@
         </w:tc>
         <w:tc>
           <w:tcPr>
-            <w:tcW w:type="dxa" w:w="665"/>
+            <w:tcW w:type="dxa" w:w="576"/>
           </w:tcPr>
           <w:p>
             <w:r>
@@ -2869,7 +3031,7 @@
         </w:tc>
         <w:tc>
           <w:tcPr>
-            <w:tcW w:type="dxa" w:w="665"/>
+            <w:tcW w:type="dxa" w:w="576"/>
           </w:tcPr>
           <w:p>
             <w:r>
@@ -2879,7 +3041,7 @@
         </w:tc>
         <w:tc>
           <w:tcPr>
-            <w:tcW w:type="dxa" w:w="665"/>
+            <w:tcW w:type="dxa" w:w="576"/>
           </w:tcPr>
           <w:p>
             <w:r>
@@ -2889,7 +3051,27 @@
         </w:tc>
         <w:tc>
           <w:tcPr>
-            <w:tcW w:type="dxa" w:w="665"/>
+            <w:tcW w:type="dxa" w:w="576"/>
+          </w:tcPr>
+          <w:p>
+            <w:r>
+              <w:t>3.23</w:t>
+            </w:r>
+          </w:p>
+        </w:tc>
+        <w:tc>
+          <w:tcPr>
+            <w:tcW w:type="dxa" w:w="576"/>
+          </w:tcPr>
+          <w:p>
+            <w:r>
+              <w:t>3.55</w:t>
+            </w:r>
+          </w:p>
+        </w:tc>
+        <w:tc>
+          <w:tcPr>
+            <w:tcW w:type="dxa" w:w="576"/>
           </w:tcPr>
           <w:p>
             <w:r>
@@ -2899,7 +3081,7 @@
         </w:tc>
         <w:tc>
           <w:tcPr>
-            <w:tcW w:type="dxa" w:w="665"/>
+            <w:tcW w:type="dxa" w:w="576"/>
           </w:tcPr>
           <w:p>
             <w:r>
@@ -2909,7 +3091,7 @@
         </w:tc>
         <w:tc>
           <w:tcPr>
-            <w:tcW w:type="dxa" w:w="665"/>
+            <w:tcW w:type="dxa" w:w="576"/>
           </w:tcPr>
           <w:p>
             <w:r>
@@ -2919,7 +3101,7 @@
         </w:tc>
         <w:tc>
           <w:tcPr>
-            <w:tcW w:type="dxa" w:w="665"/>
+            <w:tcW w:type="dxa" w:w="576"/>
           </w:tcPr>
           <w:p>
             <w:r>
@@ -2931,7 +3113,7 @@
       <w:tr>
         <w:tc>
           <w:tcPr>
-            <w:tcW w:type="dxa" w:w="665"/>
+            <w:tcW w:type="dxa" w:w="576"/>
           </w:tcPr>
           <w:p>
             <w:r>
@@ -2941,7 +3123,7 @@
         </w:tc>
         <w:tc>
           <w:tcPr>
-            <w:tcW w:type="dxa" w:w="665"/>
+            <w:tcW w:type="dxa" w:w="576"/>
           </w:tcPr>
           <w:p>
             <w:r>
@@ -2951,7 +3133,7 @@
         </w:tc>
         <w:tc>
           <w:tcPr>
-            <w:tcW w:type="dxa" w:w="665"/>
+            <w:tcW w:type="dxa" w:w="576"/>
           </w:tcPr>
           <w:p>
             <w:r>
@@ -2961,7 +3143,7 @@
         </w:tc>
         <w:tc>
           <w:tcPr>
-            <w:tcW w:type="dxa" w:w="665"/>
+            <w:tcW w:type="dxa" w:w="576"/>
           </w:tcPr>
           <w:p>
             <w:r>
@@ -2971,7 +3153,7 @@
         </w:tc>
         <w:tc>
           <w:tcPr>
-            <w:tcW w:type="dxa" w:w="665"/>
+            <w:tcW w:type="dxa" w:w="576"/>
           </w:tcPr>
           <w:p>
             <w:r>
@@ -2981,7 +3163,7 @@
         </w:tc>
         <w:tc>
           <w:tcPr>
-            <w:tcW w:type="dxa" w:w="665"/>
+            <w:tcW w:type="dxa" w:w="576"/>
           </w:tcPr>
           <w:p>
             <w:r>
@@ -2991,7 +3173,7 @@
         </w:tc>
         <w:tc>
           <w:tcPr>
-            <w:tcW w:type="dxa" w:w="665"/>
+            <w:tcW w:type="dxa" w:w="576"/>
           </w:tcPr>
           <w:p>
             <w:r>
@@ -3001,7 +3183,7 @@
         </w:tc>
         <w:tc>
           <w:tcPr>
-            <w:tcW w:type="dxa" w:w="665"/>
+            <w:tcW w:type="dxa" w:w="576"/>
           </w:tcPr>
           <w:p>
             <w:r>
@@ -3011,7 +3193,7 @@
         </w:tc>
         <w:tc>
           <w:tcPr>
-            <w:tcW w:type="dxa" w:w="665"/>
+            <w:tcW w:type="dxa" w:w="576"/>
           </w:tcPr>
           <w:p>
             <w:r>
@@ -3021,7 +3203,27 @@
         </w:tc>
         <w:tc>
           <w:tcPr>
-            <w:tcW w:type="dxa" w:w="665"/>
+            <w:tcW w:type="dxa" w:w="576"/>
+          </w:tcPr>
+          <w:p>
+            <w:r>
+              <w:t>3.14</w:t>
+            </w:r>
+          </w:p>
+        </w:tc>
+        <w:tc>
+          <w:tcPr>
+            <w:tcW w:type="dxa" w:w="576"/>
+          </w:tcPr>
+          <w:p>
+            <w:r>
+              <w:t>3.66</w:t>
+            </w:r>
+          </w:p>
+        </w:tc>
+        <w:tc>
+          <w:tcPr>
+            <w:tcW w:type="dxa" w:w="576"/>
           </w:tcPr>
           <w:p>
             <w:r>
@@ -3031,7 +3233,7 @@
         </w:tc>
         <w:tc>
           <w:tcPr>
-            <w:tcW w:type="dxa" w:w="665"/>
+            <w:tcW w:type="dxa" w:w="576"/>
           </w:tcPr>
           <w:p>
             <w:r>
@@ -3041,7 +3243,7 @@
         </w:tc>
         <w:tc>
           <w:tcPr>
-            <w:tcW w:type="dxa" w:w="665"/>
+            <w:tcW w:type="dxa" w:w="576"/>
           </w:tcPr>
           <w:p>
             <w:r>
@@ -3051,7 +3253,7 @@
         </w:tc>
         <w:tc>
           <w:tcPr>
-            <w:tcW w:type="dxa" w:w="665"/>
+            <w:tcW w:type="dxa" w:w="576"/>
           </w:tcPr>
           <w:p>
             <w:r>
@@ -3063,7 +3265,7 @@
       <w:tr>
         <w:tc>
           <w:tcPr>
-            <w:tcW w:type="dxa" w:w="665"/>
+            <w:tcW w:type="dxa" w:w="576"/>
           </w:tcPr>
           <w:p>
             <w:r>
@@ -3073,7 +3275,7 @@
         </w:tc>
         <w:tc>
           <w:tcPr>
-            <w:tcW w:type="dxa" w:w="665"/>
+            <w:tcW w:type="dxa" w:w="576"/>
           </w:tcPr>
           <w:p>
             <w:r>
@@ -3083,7 +3285,7 @@
         </w:tc>
         <w:tc>
           <w:tcPr>
-            <w:tcW w:type="dxa" w:w="665"/>
+            <w:tcW w:type="dxa" w:w="576"/>
           </w:tcPr>
           <w:p>
             <w:r>
@@ -3093,7 +3295,7 @@
         </w:tc>
         <w:tc>
           <w:tcPr>
-            <w:tcW w:type="dxa" w:w="665"/>
+            <w:tcW w:type="dxa" w:w="576"/>
           </w:tcPr>
           <w:p>
             <w:r>
@@ -3103,7 +3305,7 @@
         </w:tc>
         <w:tc>
           <w:tcPr>
-            <w:tcW w:type="dxa" w:w="665"/>
+            <w:tcW w:type="dxa" w:w="576"/>
           </w:tcPr>
           <w:p>
             <w:r>
@@ -3113,7 +3315,7 @@
         </w:tc>
         <w:tc>
           <w:tcPr>
-            <w:tcW w:type="dxa" w:w="665"/>
+            <w:tcW w:type="dxa" w:w="576"/>
           </w:tcPr>
           <w:p>
             <w:r>
@@ -3123,7 +3325,7 @@
         </w:tc>
         <w:tc>
           <w:tcPr>
-            <w:tcW w:type="dxa" w:w="665"/>
+            <w:tcW w:type="dxa" w:w="576"/>
           </w:tcPr>
           <w:p>
             <w:r>
@@ -3133,7 +3335,7 @@
         </w:tc>
         <w:tc>
           <w:tcPr>
-            <w:tcW w:type="dxa" w:w="665"/>
+            <w:tcW w:type="dxa" w:w="576"/>
           </w:tcPr>
           <w:p>
             <w:r>
@@ -3143,7 +3345,7 @@
         </w:tc>
         <w:tc>
           <w:tcPr>
-            <w:tcW w:type="dxa" w:w="665"/>
+            <w:tcW w:type="dxa" w:w="576"/>
           </w:tcPr>
           <w:p>
             <w:r>
@@ -3153,7 +3355,27 @@
         </w:tc>
         <w:tc>
           <w:tcPr>
-            <w:tcW w:type="dxa" w:w="665"/>
+            <w:tcW w:type="dxa" w:w="576"/>
+          </w:tcPr>
+          <w:p>
+            <w:r>
+              <w:t>3.53</w:t>
+            </w:r>
+          </w:p>
+        </w:tc>
+        <w:tc>
+          <w:tcPr>
+            <w:tcW w:type="dxa" w:w="576"/>
+          </w:tcPr>
+          <w:p>
+            <w:r>
+              <w:t>3.41</w:t>
+            </w:r>
+          </w:p>
+        </w:tc>
+        <w:tc>
+          <w:tcPr>
+            <w:tcW w:type="dxa" w:w="576"/>
           </w:tcPr>
           <w:p>
             <w:r>
@@ -3163,7 +3385,7 @@
         </w:tc>
         <w:tc>
           <w:tcPr>
-            <w:tcW w:type="dxa" w:w="665"/>
+            <w:tcW w:type="dxa" w:w="576"/>
           </w:tcPr>
           <w:p>
             <w:r>
@@ -3173,7 +3395,7 @@
         </w:tc>
         <w:tc>
           <w:tcPr>
-            <w:tcW w:type="dxa" w:w="665"/>
+            <w:tcW w:type="dxa" w:w="576"/>
           </w:tcPr>
           <w:p>
             <w:r>
@@ -3183,7 +3405,7 @@
         </w:tc>
         <w:tc>
           <w:tcPr>
-            <w:tcW w:type="dxa" w:w="665"/>
+            <w:tcW w:type="dxa" w:w="576"/>
           </w:tcPr>
           <w:p>
             <w:r>
@@ -3195,7 +3417,7 @@
       <w:tr>
         <w:tc>
           <w:tcPr>
-            <w:tcW w:type="dxa" w:w="665"/>
+            <w:tcW w:type="dxa" w:w="576"/>
           </w:tcPr>
           <w:p>
             <w:r>
@@ -3205,7 +3427,7 @@
         </w:tc>
         <w:tc>
           <w:tcPr>
-            <w:tcW w:type="dxa" w:w="665"/>
+            <w:tcW w:type="dxa" w:w="576"/>
           </w:tcPr>
           <w:p>
             <w:r>
@@ -3215,7 +3437,7 @@
         </w:tc>
         <w:tc>
           <w:tcPr>
-            <w:tcW w:type="dxa" w:w="665"/>
+            <w:tcW w:type="dxa" w:w="576"/>
           </w:tcPr>
           <w:p>
             <w:r>
@@ -3225,7 +3447,7 @@
         </w:tc>
         <w:tc>
           <w:tcPr>
-            <w:tcW w:type="dxa" w:w="665"/>
+            <w:tcW w:type="dxa" w:w="576"/>
           </w:tcPr>
           <w:p>
             <w:r>
@@ -3235,7 +3457,7 @@
         </w:tc>
         <w:tc>
           <w:tcPr>
-            <w:tcW w:type="dxa" w:w="665"/>
+            <w:tcW w:type="dxa" w:w="576"/>
           </w:tcPr>
           <w:p>
             <w:r>
@@ -3245,7 +3467,7 @@
         </w:tc>
         <w:tc>
           <w:tcPr>
-            <w:tcW w:type="dxa" w:w="665"/>
+            <w:tcW w:type="dxa" w:w="576"/>
           </w:tcPr>
           <w:p>
             <w:r>
@@ -3255,7 +3477,7 @@
         </w:tc>
         <w:tc>
           <w:tcPr>
-            <w:tcW w:type="dxa" w:w="665"/>
+            <w:tcW w:type="dxa" w:w="576"/>
           </w:tcPr>
           <w:p>
             <w:r>
@@ -3265,7 +3487,7 @@
         </w:tc>
         <w:tc>
           <w:tcPr>
-            <w:tcW w:type="dxa" w:w="665"/>
+            <w:tcW w:type="dxa" w:w="576"/>
           </w:tcPr>
           <w:p>
             <w:r>
@@ -3275,7 +3497,7 @@
         </w:tc>
         <w:tc>
           <w:tcPr>
-            <w:tcW w:type="dxa" w:w="665"/>
+            <w:tcW w:type="dxa" w:w="576"/>
           </w:tcPr>
           <w:p>
             <w:r>
@@ -3285,7 +3507,27 @@
         </w:tc>
         <w:tc>
           <w:tcPr>
-            <w:tcW w:type="dxa" w:w="665"/>
+            <w:tcW w:type="dxa" w:w="576"/>
+          </w:tcPr>
+          <w:p>
+            <w:r>
+              <w:t>3.28</w:t>
+            </w:r>
+          </w:p>
+        </w:tc>
+        <w:tc>
+          <w:tcPr>
+            <w:tcW w:type="dxa" w:w="576"/>
+          </w:tcPr>
+          <w:p>
+            <w:r>
+              <w:t>4.00</w:t>
+            </w:r>
+          </w:p>
+        </w:tc>
+        <w:tc>
+          <w:tcPr>
+            <w:tcW w:type="dxa" w:w="576"/>
           </w:tcPr>
           <w:p>
             <w:r>
@@ -3295,7 +3537,7 @@
         </w:tc>
         <w:tc>
           <w:tcPr>
-            <w:tcW w:type="dxa" w:w="665"/>
+            <w:tcW w:type="dxa" w:w="576"/>
           </w:tcPr>
           <w:p>
             <w:r>
@@ -3305,7 +3547,7 @@
         </w:tc>
         <w:tc>
           <w:tcPr>
-            <w:tcW w:type="dxa" w:w="665"/>
+            <w:tcW w:type="dxa" w:w="576"/>
           </w:tcPr>
           <w:p>
             <w:r>
@@ -3315,7 +3557,7 @@
         </w:tc>
         <w:tc>
           <w:tcPr>
-            <w:tcW w:type="dxa" w:w="665"/>
+            <w:tcW w:type="dxa" w:w="576"/>
           </w:tcPr>
           <w:p>
             <w:r>
@@ -3327,7 +3569,7 @@
       <w:tr>
         <w:tc>
           <w:tcPr>
-            <w:tcW w:type="dxa" w:w="665"/>
+            <w:tcW w:type="dxa" w:w="576"/>
           </w:tcPr>
           <w:p>
             <w:r>
@@ -3337,7 +3579,7 @@
         </w:tc>
         <w:tc>
           <w:tcPr>
-            <w:tcW w:type="dxa" w:w="665"/>
+            <w:tcW w:type="dxa" w:w="576"/>
           </w:tcPr>
           <w:p>
             <w:r>
@@ -3347,7 +3589,7 @@
         </w:tc>
         <w:tc>
           <w:tcPr>
-            <w:tcW w:type="dxa" w:w="665"/>
+            <w:tcW w:type="dxa" w:w="576"/>
           </w:tcPr>
           <w:p>
             <w:r>
@@ -3357,7 +3599,7 @@
         </w:tc>
         <w:tc>
           <w:tcPr>
-            <w:tcW w:type="dxa" w:w="665"/>
+            <w:tcW w:type="dxa" w:w="576"/>
           </w:tcPr>
           <w:p>
             <w:r>
@@ -3367,7 +3609,7 @@
         </w:tc>
         <w:tc>
           <w:tcPr>
-            <w:tcW w:type="dxa" w:w="665"/>
+            <w:tcW w:type="dxa" w:w="576"/>
           </w:tcPr>
           <w:p>
             <w:r>
@@ -3377,7 +3619,7 @@
         </w:tc>
         <w:tc>
           <w:tcPr>
-            <w:tcW w:type="dxa" w:w="665"/>
+            <w:tcW w:type="dxa" w:w="576"/>
           </w:tcPr>
           <w:p>
             <w:r>
@@ -3387,7 +3629,7 @@
         </w:tc>
         <w:tc>
           <w:tcPr>
-            <w:tcW w:type="dxa" w:w="665"/>
+            <w:tcW w:type="dxa" w:w="576"/>
           </w:tcPr>
           <w:p>
             <w:r>
@@ -3397,7 +3639,7 @@
         </w:tc>
         <w:tc>
           <w:tcPr>
-            <w:tcW w:type="dxa" w:w="665"/>
+            <w:tcW w:type="dxa" w:w="576"/>
           </w:tcPr>
           <w:p>
             <w:r>
@@ -3407,7 +3649,7 @@
         </w:tc>
         <w:tc>
           <w:tcPr>
-            <w:tcW w:type="dxa" w:w="665"/>
+            <w:tcW w:type="dxa" w:w="576"/>
           </w:tcPr>
           <w:p>
             <w:r>
@@ -3417,7 +3659,27 @@
         </w:tc>
         <w:tc>
           <w:tcPr>
-            <w:tcW w:type="dxa" w:w="665"/>
+            <w:tcW w:type="dxa" w:w="576"/>
+          </w:tcPr>
+          <w:p>
+            <w:r>
+              <w:t>4.40</w:t>
+            </w:r>
+          </w:p>
+        </w:tc>
+        <w:tc>
+          <w:tcPr>
+            <w:tcW w:type="dxa" w:w="576"/>
+          </w:tcPr>
+          <w:p>
+            <w:r>
+              <w:t>3.46</w:t>
+            </w:r>
+          </w:p>
+        </w:tc>
+        <w:tc>
+          <w:tcPr>
+            <w:tcW w:type="dxa" w:w="576"/>
           </w:tcPr>
           <w:p>
             <w:r>
@@ -3427,7 +3689,7 @@
         </w:tc>
         <w:tc>
           <w:tcPr>
-            <w:tcW w:type="dxa" w:w="665"/>
+            <w:tcW w:type="dxa" w:w="576"/>
           </w:tcPr>
           <w:p>
             <w:r>
@@ -3437,7 +3699,7 @@
         </w:tc>
         <w:tc>
           <w:tcPr>
-            <w:tcW w:type="dxa" w:w="665"/>
+            <w:tcW w:type="dxa" w:w="576"/>
           </w:tcPr>
           <w:p>
             <w:r>
@@ -3447,7 +3709,7 @@
         </w:tc>
         <w:tc>
           <w:tcPr>
-            <w:tcW w:type="dxa" w:w="665"/>
+            <w:tcW w:type="dxa" w:w="576"/>
           </w:tcPr>
           <w:p>
             <w:r>
@@ -3459,7 +3721,7 @@
       <w:tr>
         <w:tc>
           <w:tcPr>
-            <w:tcW w:type="dxa" w:w="665"/>
+            <w:tcW w:type="dxa" w:w="576"/>
           </w:tcPr>
           <w:p>
             <w:r>
@@ -3469,7 +3731,7 @@
         </w:tc>
         <w:tc>
           <w:tcPr>
-            <w:tcW w:type="dxa" w:w="665"/>
+            <w:tcW w:type="dxa" w:w="576"/>
           </w:tcPr>
           <w:p>
             <w:r>
@@ -3479,7 +3741,7 @@
         </w:tc>
         <w:tc>
           <w:tcPr>
-            <w:tcW w:type="dxa" w:w="665"/>
+            <w:tcW w:type="dxa" w:w="576"/>
           </w:tcPr>
           <w:p>
             <w:r>
@@ -3489,7 +3751,7 @@
         </w:tc>
         <w:tc>
           <w:tcPr>
-            <w:tcW w:type="dxa" w:w="665"/>
+            <w:tcW w:type="dxa" w:w="576"/>
           </w:tcPr>
           <w:p>
             <w:r>
@@ -3499,7 +3761,7 @@
         </w:tc>
         <w:tc>
           <w:tcPr>
-            <w:tcW w:type="dxa" w:w="665"/>
+            <w:tcW w:type="dxa" w:w="576"/>
           </w:tcPr>
           <w:p>
             <w:r>
@@ -3509,7 +3771,7 @@
         </w:tc>
         <w:tc>
           <w:tcPr>
-            <w:tcW w:type="dxa" w:w="665"/>
+            <w:tcW w:type="dxa" w:w="576"/>
           </w:tcPr>
           <w:p>
             <w:r>
@@ -3519,7 +3781,7 @@
         </w:tc>
         <w:tc>
           <w:tcPr>
-            <w:tcW w:type="dxa" w:w="665"/>
+            <w:tcW w:type="dxa" w:w="576"/>
           </w:tcPr>
           <w:p>
             <w:r>
@@ -3529,7 +3791,7 @@
         </w:tc>
         <w:tc>
           <w:tcPr>
-            <w:tcW w:type="dxa" w:w="665"/>
+            <w:tcW w:type="dxa" w:w="576"/>
           </w:tcPr>
           <w:p>
             <w:r>
@@ -3539,7 +3801,7 @@
         </w:tc>
         <w:tc>
           <w:tcPr>
-            <w:tcW w:type="dxa" w:w="665"/>
+            <w:tcW w:type="dxa" w:w="576"/>
           </w:tcPr>
           <w:p>
             <w:r>
@@ -3549,7 +3811,27 @@
         </w:tc>
         <w:tc>
           <w:tcPr>
-            <w:tcW w:type="dxa" w:w="665"/>
+            <w:tcW w:type="dxa" w:w="576"/>
+          </w:tcPr>
+          <w:p>
+            <w:r>
+              <w:t>4.10</w:t>
+            </w:r>
+          </w:p>
+        </w:tc>
+        <w:tc>
+          <w:tcPr>
+            <w:tcW w:type="dxa" w:w="576"/>
+          </w:tcPr>
+          <w:p>
+            <w:r>
+              <w:t>3.18</w:t>
+            </w:r>
+          </w:p>
+        </w:tc>
+        <w:tc>
+          <w:tcPr>
+            <w:tcW w:type="dxa" w:w="576"/>
           </w:tcPr>
           <w:p>
             <w:r>
@@ -3559,7 +3841,7 @@
         </w:tc>
         <w:tc>
           <w:tcPr>
-            <w:tcW w:type="dxa" w:w="665"/>
+            <w:tcW w:type="dxa" w:w="576"/>
           </w:tcPr>
           <w:p>
             <w:r>
@@ -3569,7 +3851,7 @@
         </w:tc>
         <w:tc>
           <w:tcPr>
-            <w:tcW w:type="dxa" w:w="665"/>
+            <w:tcW w:type="dxa" w:w="576"/>
           </w:tcPr>
           <w:p>
             <w:r>
@@ -3579,7 +3861,7 @@
         </w:tc>
         <w:tc>
           <w:tcPr>
-            <w:tcW w:type="dxa" w:w="665"/>
+            <w:tcW w:type="dxa" w:w="576"/>
           </w:tcPr>
           <w:p>
             <w:r>
@@ -3591,7 +3873,7 @@
       <w:tr>
         <w:tc>
           <w:tcPr>
-            <w:tcW w:type="dxa" w:w="665"/>
+            <w:tcW w:type="dxa" w:w="576"/>
           </w:tcPr>
           <w:p>
             <w:r>
@@ -3601,7 +3883,7 @@
         </w:tc>
         <w:tc>
           <w:tcPr>
-            <w:tcW w:type="dxa" w:w="665"/>
+            <w:tcW w:type="dxa" w:w="576"/>
           </w:tcPr>
           <w:p>
             <w:r>
@@ -3611,7 +3893,7 @@
         </w:tc>
         <w:tc>
           <w:tcPr>
-            <w:tcW w:type="dxa" w:w="665"/>
+            <w:tcW w:type="dxa" w:w="576"/>
           </w:tcPr>
           <w:p>
             <w:r>
@@ -3621,7 +3903,7 @@
         </w:tc>
         <w:tc>
           <w:tcPr>
-            <w:tcW w:type="dxa" w:w="665"/>
+            <w:tcW w:type="dxa" w:w="576"/>
           </w:tcPr>
           <w:p>
             <w:r>
@@ -3631,7 +3913,7 @@
         </w:tc>
         <w:tc>
           <w:tcPr>
-            <w:tcW w:type="dxa" w:w="665"/>
+            <w:tcW w:type="dxa" w:w="576"/>
           </w:tcPr>
           <w:p>
             <w:r>
@@ -3641,7 +3923,7 @@
         </w:tc>
         <w:tc>
           <w:tcPr>
-            <w:tcW w:type="dxa" w:w="665"/>
+            <w:tcW w:type="dxa" w:w="576"/>
           </w:tcPr>
           <w:p>
             <w:r>
@@ -3651,7 +3933,7 @@
         </w:tc>
         <w:tc>
           <w:tcPr>
-            <w:tcW w:type="dxa" w:w="665"/>
+            <w:tcW w:type="dxa" w:w="576"/>
           </w:tcPr>
           <w:p>
             <w:r>
@@ -3661,7 +3943,7 @@
         </w:tc>
         <w:tc>
           <w:tcPr>
-            <w:tcW w:type="dxa" w:w="665"/>
+            <w:tcW w:type="dxa" w:w="576"/>
           </w:tcPr>
           <w:p>
             <w:r>
@@ -3671,7 +3953,7 @@
         </w:tc>
         <w:tc>
           <w:tcPr>
-            <w:tcW w:type="dxa" w:w="665"/>
+            <w:tcW w:type="dxa" w:w="576"/>
           </w:tcPr>
           <w:p>
             <w:r>
@@ -3681,7 +3963,27 @@
         </w:tc>
         <w:tc>
           <w:tcPr>
-            <w:tcW w:type="dxa" w:w="665"/>
+            <w:tcW w:type="dxa" w:w="576"/>
+          </w:tcPr>
+          <w:p>
+            <w:r>
+              <w:t>3.21</w:t>
+            </w:r>
+          </w:p>
+        </w:tc>
+        <w:tc>
+          <w:tcPr>
+            <w:tcW w:type="dxa" w:w="576"/>
+          </w:tcPr>
+          <w:p>
+            <w:r>
+              <w:t>4.72</w:t>
+            </w:r>
+          </w:p>
+        </w:tc>
+        <w:tc>
+          <w:tcPr>
+            <w:tcW w:type="dxa" w:w="576"/>
           </w:tcPr>
           <w:p>
             <w:r>
@@ -3691,7 +3993,7 @@
         </w:tc>
         <w:tc>
           <w:tcPr>
-            <w:tcW w:type="dxa" w:w="665"/>
+            <w:tcW w:type="dxa" w:w="576"/>
           </w:tcPr>
           <w:p>
             <w:r>
@@ -3701,7 +4003,7 @@
         </w:tc>
         <w:tc>
           <w:tcPr>
-            <w:tcW w:type="dxa" w:w="665"/>
+            <w:tcW w:type="dxa" w:w="576"/>
           </w:tcPr>
           <w:p>
             <w:r>
@@ -3711,7 +4013,7 @@
         </w:tc>
         <w:tc>
           <w:tcPr>
-            <w:tcW w:type="dxa" w:w="665"/>
+            <w:tcW w:type="dxa" w:w="576"/>
           </w:tcPr>
           <w:p>
             <w:r>
@@ -3723,7 +4025,7 @@
       <w:tr>
         <w:tc>
           <w:tcPr>
-            <w:tcW w:type="dxa" w:w="665"/>
+            <w:tcW w:type="dxa" w:w="576"/>
           </w:tcPr>
           <w:p>
             <w:r>
@@ -3733,7 +4035,7 @@
         </w:tc>
         <w:tc>
           <w:tcPr>
-            <w:tcW w:type="dxa" w:w="665"/>
+            <w:tcW w:type="dxa" w:w="576"/>
           </w:tcPr>
           <w:p>
             <w:r>
@@ -3743,7 +4045,7 @@
         </w:tc>
         <w:tc>
           <w:tcPr>
-            <w:tcW w:type="dxa" w:w="665"/>
+            <w:tcW w:type="dxa" w:w="576"/>
           </w:tcPr>
           <w:p>
             <w:r>
@@ -3753,7 +4055,7 @@
         </w:tc>
         <w:tc>
           <w:tcPr>
-            <w:tcW w:type="dxa" w:w="665"/>
+            <w:tcW w:type="dxa" w:w="576"/>
           </w:tcPr>
           <w:p>
             <w:r>
@@ -3763,7 +4065,7 @@
         </w:tc>
         <w:tc>
           <w:tcPr>
-            <w:tcW w:type="dxa" w:w="665"/>
+            <w:tcW w:type="dxa" w:w="576"/>
           </w:tcPr>
           <w:p>
             <w:r>
@@ -3773,7 +4075,7 @@
         </w:tc>
         <w:tc>
           <w:tcPr>
-            <w:tcW w:type="dxa" w:w="665"/>
+            <w:tcW w:type="dxa" w:w="576"/>
           </w:tcPr>
           <w:p>
             <w:r>
@@ -3783,7 +4085,7 @@
         </w:tc>
         <w:tc>
           <w:tcPr>
-            <w:tcW w:type="dxa" w:w="665"/>
+            <w:tcW w:type="dxa" w:w="576"/>
           </w:tcPr>
           <w:p>
             <w:r>
@@ -3793,7 +4095,7 @@
         </w:tc>
         <w:tc>
           <w:tcPr>
-            <w:tcW w:type="dxa" w:w="665"/>
+            <w:tcW w:type="dxa" w:w="576"/>
           </w:tcPr>
           <w:p>
             <w:r>
@@ -3803,7 +4105,7 @@
         </w:tc>
         <w:tc>
           <w:tcPr>
-            <w:tcW w:type="dxa" w:w="665"/>
+            <w:tcW w:type="dxa" w:w="576"/>
           </w:tcPr>
           <w:p>
             <w:r>
@@ -3813,7 +4115,27 @@
         </w:tc>
         <w:tc>
           <w:tcPr>
-            <w:tcW w:type="dxa" w:w="665"/>
+            <w:tcW w:type="dxa" w:w="576"/>
+          </w:tcPr>
+          <w:p>
+            <w:r>
+              <w:t>5.57</w:t>
+            </w:r>
+          </w:p>
+        </w:tc>
+        <w:tc>
+          <w:tcPr>
+            <w:tcW w:type="dxa" w:w="576"/>
+          </w:tcPr>
+          <w:p>
+            <w:r>
+              <w:t>4.31</w:t>
+            </w:r>
+          </w:p>
+        </w:tc>
+        <w:tc>
+          <w:tcPr>
+            <w:tcW w:type="dxa" w:w="576"/>
           </w:tcPr>
           <w:p>
             <w:r>
@@ -3823,7 +4145,7 @@
         </w:tc>
         <w:tc>
           <w:tcPr>
-            <w:tcW w:type="dxa" w:w="665"/>
+            <w:tcW w:type="dxa" w:w="576"/>
           </w:tcPr>
           <w:p>
             <w:r>
@@ -3833,7 +4155,7 @@
         </w:tc>
         <w:tc>
           <w:tcPr>
-            <w:tcW w:type="dxa" w:w="665"/>
+            <w:tcW w:type="dxa" w:w="576"/>
           </w:tcPr>
           <w:p>
             <w:r>
@@ -3843,7 +4165,7 @@
         </w:tc>
         <w:tc>
           <w:tcPr>
-            <w:tcW w:type="dxa" w:w="665"/>
+            <w:tcW w:type="dxa" w:w="576"/>
           </w:tcPr>
           <w:p>
             <w:r>
@@ -3855,7 +4177,7 @@
       <w:tr>
         <w:tc>
           <w:tcPr>
-            <w:tcW w:type="dxa" w:w="665"/>
+            <w:tcW w:type="dxa" w:w="576"/>
           </w:tcPr>
           <w:p>
             <w:r>
@@ -3865,7 +4187,7 @@
         </w:tc>
         <w:tc>
           <w:tcPr>
-            <w:tcW w:type="dxa" w:w="665"/>
+            <w:tcW w:type="dxa" w:w="576"/>
           </w:tcPr>
           <w:p>
             <w:r>
@@ -3875,7 +4197,7 @@
         </w:tc>
         <w:tc>
           <w:tcPr>
-            <w:tcW w:type="dxa" w:w="665"/>
+            <w:tcW w:type="dxa" w:w="576"/>
           </w:tcPr>
           <w:p>
             <w:r>
@@ -3885,7 +4207,7 @@
         </w:tc>
         <w:tc>
           <w:tcPr>
-            <w:tcW w:type="dxa" w:w="665"/>
+            <w:tcW w:type="dxa" w:w="576"/>
           </w:tcPr>
           <w:p>
             <w:r>
@@ -3895,7 +4217,7 @@
         </w:tc>
         <w:tc>
           <w:tcPr>
-            <w:tcW w:type="dxa" w:w="665"/>
+            <w:tcW w:type="dxa" w:w="576"/>
           </w:tcPr>
           <w:p>
             <w:r>
@@ -3905,7 +4227,7 @@
         </w:tc>
         <w:tc>
           <w:tcPr>
-            <w:tcW w:type="dxa" w:w="665"/>
+            <w:tcW w:type="dxa" w:w="576"/>
           </w:tcPr>
           <w:p>
             <w:r>
@@ -3915,7 +4237,7 @@
         </w:tc>
         <w:tc>
           <w:tcPr>
-            <w:tcW w:type="dxa" w:w="665"/>
+            <w:tcW w:type="dxa" w:w="576"/>
           </w:tcPr>
           <w:p>
             <w:r>
@@ -3925,7 +4247,7 @@
         </w:tc>
         <w:tc>
           <w:tcPr>
-            <w:tcW w:type="dxa" w:w="665"/>
+            <w:tcW w:type="dxa" w:w="576"/>
           </w:tcPr>
           <w:p>
             <w:r>
@@ -3935,7 +4257,7 @@
         </w:tc>
         <w:tc>
           <w:tcPr>
-            <w:tcW w:type="dxa" w:w="665"/>
+            <w:tcW w:type="dxa" w:w="576"/>
           </w:tcPr>
           <w:p>
             <w:r>
@@ -3945,7 +4267,27 @@
         </w:tc>
         <w:tc>
           <w:tcPr>
-            <w:tcW w:type="dxa" w:w="665"/>
+            <w:tcW w:type="dxa" w:w="576"/>
+          </w:tcPr>
+          <w:p>
+            <w:r>
+              <w:t>2.35</w:t>
+            </w:r>
+          </w:p>
+        </w:tc>
+        <w:tc>
+          <w:tcPr>
+            <w:tcW w:type="dxa" w:w="576"/>
+          </w:tcPr>
+          <w:p>
+            <w:r>
+              <w:t>5.30</w:t>
+            </w:r>
+          </w:p>
+        </w:tc>
+        <w:tc>
+          <w:tcPr>
+            <w:tcW w:type="dxa" w:w="576"/>
           </w:tcPr>
           <w:p>
             <w:r>
@@ -3955,7 +4297,7 @@
         </w:tc>
         <w:tc>
           <w:tcPr>
-            <w:tcW w:type="dxa" w:w="665"/>
+            <w:tcW w:type="dxa" w:w="576"/>
           </w:tcPr>
           <w:p>
             <w:r>
@@ -3965,7 +4307,7 @@
         </w:tc>
         <w:tc>
           <w:tcPr>
-            <w:tcW w:type="dxa" w:w="665"/>
+            <w:tcW w:type="dxa" w:w="576"/>
           </w:tcPr>
           <w:p>
             <w:r>
@@ -3975,7 +4317,7 @@
         </w:tc>
         <w:tc>
           <w:tcPr>
-            <w:tcW w:type="dxa" w:w="665"/>
+            <w:tcW w:type="dxa" w:w="576"/>
           </w:tcPr>
           <w:p>
             <w:r>
@@ -3987,7 +4329,7 @@
       <w:tr>
         <w:tc>
           <w:tcPr>
-            <w:tcW w:type="dxa" w:w="665"/>
+            <w:tcW w:type="dxa" w:w="576"/>
           </w:tcPr>
           <w:p>
             <w:r>
@@ -3997,7 +4339,7 @@
         </w:tc>
         <w:tc>
           <w:tcPr>
-            <w:tcW w:type="dxa" w:w="665"/>
+            <w:tcW w:type="dxa" w:w="576"/>
           </w:tcPr>
           <w:p>
             <w:r>
@@ -4007,7 +4349,7 @@
         </w:tc>
         <w:tc>
           <w:tcPr>
-            <w:tcW w:type="dxa" w:w="665"/>
+            <w:tcW w:type="dxa" w:w="576"/>
           </w:tcPr>
           <w:p>
             <w:r>
@@ -4017,7 +4359,7 @@
         </w:tc>
         <w:tc>
           <w:tcPr>
-            <w:tcW w:type="dxa" w:w="665"/>
+            <w:tcW w:type="dxa" w:w="576"/>
           </w:tcPr>
           <w:p>
             <w:r>
@@ -4027,7 +4369,7 @@
         </w:tc>
         <w:tc>
           <w:tcPr>
-            <w:tcW w:type="dxa" w:w="665"/>
+            <w:tcW w:type="dxa" w:w="576"/>
           </w:tcPr>
           <w:p>
             <w:r>
@@ -4037,7 +4379,7 @@
         </w:tc>
         <w:tc>
           <w:tcPr>
-            <w:tcW w:type="dxa" w:w="665"/>
+            <w:tcW w:type="dxa" w:w="576"/>
           </w:tcPr>
           <w:p>
             <w:r>
@@ -4047,7 +4389,7 @@
         </w:tc>
         <w:tc>
           <w:tcPr>
-            <w:tcW w:type="dxa" w:w="665"/>
+            <w:tcW w:type="dxa" w:w="576"/>
           </w:tcPr>
           <w:p>
             <w:r>
@@ -4057,7 +4399,7 @@
         </w:tc>
         <w:tc>
           <w:tcPr>
-            <w:tcW w:type="dxa" w:w="665"/>
+            <w:tcW w:type="dxa" w:w="576"/>
           </w:tcPr>
           <w:p>
             <w:r>
@@ -4067,7 +4409,7 @@
         </w:tc>
         <w:tc>
           <w:tcPr>
-            <w:tcW w:type="dxa" w:w="665"/>
+            <w:tcW w:type="dxa" w:w="576"/>
           </w:tcPr>
           <w:p>
             <w:r>
@@ -4077,7 +4419,27 @@
         </w:tc>
         <w:tc>
           <w:tcPr>
-            <w:tcW w:type="dxa" w:w="665"/>
+            <w:tcW w:type="dxa" w:w="576"/>
+          </w:tcPr>
+          <w:p>
+            <w:r>
+              <w:t>4.45</w:t>
+            </w:r>
+          </w:p>
+        </w:tc>
+        <w:tc>
+          <w:tcPr>
+            <w:tcW w:type="dxa" w:w="576"/>
+          </w:tcPr>
+          <w:p>
+            <w:r>
+              <w:t>4.55</w:t>
+            </w:r>
+          </w:p>
+        </w:tc>
+        <w:tc>
+          <w:tcPr>
+            <w:tcW w:type="dxa" w:w="576"/>
           </w:tcPr>
           <w:p>
             <w:r>
@@ -4087,7 +4449,7 @@
         </w:tc>
         <w:tc>
           <w:tcPr>
-            <w:tcW w:type="dxa" w:w="665"/>
+            <w:tcW w:type="dxa" w:w="576"/>
           </w:tcPr>
           <w:p>
             <w:r>
@@ -4097,7 +4459,7 @@
         </w:tc>
         <w:tc>
           <w:tcPr>
-            <w:tcW w:type="dxa" w:w="665"/>
+            <w:tcW w:type="dxa" w:w="576"/>
           </w:tcPr>
           <w:p>
             <w:r>
@@ -4107,7 +4469,7 @@
         </w:tc>
         <w:tc>
           <w:tcPr>
-            <w:tcW w:type="dxa" w:w="665"/>
+            <w:tcW w:type="dxa" w:w="576"/>
           </w:tcPr>
           <w:p>
             <w:r>

</xml_diff>

<commit_message>
Expand report asset group analysis
</commit_message>
<xml_diff>
--- a/reports/continuity_wave_research_report.docx
+++ b/reports/continuity_wave_research_report.docx
@@ -16,7 +16,7 @@
         <w:jc w:val="center"/>
       </w:pPr>
       <w:r>
-        <w:t>生成时间：2026-06-09 10:13；数据目录：D:\trend_score\data</w:t>
+        <w:t>生成时间：2026-06-09 14:35；数据目录：D:\trend_score\data</w:t>
       </w:r>
     </w:p>
     <w:p>
@@ -987,17 +987,106 @@
     </w:p>
     <w:p>
       <w:r>
-        <w:t>商品：覆盖 4 个品种，合计 367 个波段，中位总收益 101.8%，中位年化波动 30.4%。上涨波段占比 50.1%，波段评分中位数 63.1。</w:t>
+        <w:t>三类资产不应混在一个总榜里解释。指数更像市场系统性趋势的底座，板块更像风险偏好和产业主题的放大器，商品则更受供需、汇率和连续合约结构影响。下面按指数、板块、商品分别展开。</w:t>
+      </w:r>
+    </w:p>
+    <w:p>
+      <w:pPr>
+        <w:pStyle w:val="Heading2"/>
+      </w:pPr>
+      <w:r>
+        <w:t>指数样本分析</w:t>
       </w:r>
     </w:p>
     <w:p>
       <w:r>
-        <w:t>指数：覆盖 5 个品种，合计 617 个波段，中位总收益 46.9%，中位年化波动 24.5%。上涨波段占比 49.9%，波段评分中位数 63.7。</w:t>
+        <w:t>覆盖 5 个品种、7,775 行日线数据，识别 617 个波段。该组中位总涨跌幅为 46.9%，中位年化波动为 24.5%，自适应反转阈值折算比例中位数为 3.09%。</w:t>
       </w:r>
     </w:p>
     <w:p>
       <w:r>
-        <w:t>板块：覆盖 8 个品种，合计 760 个波段，中位总收益 46.2%，中位年化波动 27.0%。上涨波段占比 49.9%，波段评分中位数 64.2。</w:t>
+        <w:t>波段结构上，上涨波段占比 49.9%，波段持续天数中位数 9.0 天，评分中位数 63.7。最高质量样本来自 沪深300，历史最高波段评分 86.5；年化波段最密集的是 沪深300，约 21.2 段/年。</w:t>
+      </w:r>
+    </w:p>
+    <w:p>
+      <w:r>
+        <w:t>评分驱动上，该组内部最靠前的解释变量是 回撤控制分（0.67）、强度分（0.64）。这能帮助判断该资产组的高分来自顺滑推进、回撤控制，还是来自更强的单段涨跌幅。</w:t>
+      </w:r>
+    </w:p>
+    <w:p>
+      <w:r>
+        <w:t>当前约 120 个交易日区间内，组内连续性最强的是 创业板指（上涨，区间评分 77.9，方向一致性 0.53）；连续性较弱的是 上证指数（区间评分 30.7）。</w:t>
+      </w:r>
+    </w:p>
+    <w:p>
+      <w:r>
+        <w:t>指数章节的重点是识别市场底层趋势是否连续。宽基指数波段通常不如主题板块猛烈，但更适合作为风险环境的基准：如果指数连续性偏弱，而板块或商品高分，说明机会可能更偏结构性而非全面趋势。</w:t>
+      </w:r>
+    </w:p>
+    <w:p>
+      <w:pPr>
+        <w:pStyle w:val="Heading2"/>
+      </w:pPr>
+      <w:r>
+        <w:t>板块样本分析</w:t>
+      </w:r>
+    </w:p>
+    <w:p>
+      <w:r>
+        <w:t>覆盖 8 个品种、11,697 行日线数据，识别 760 个波段。该组中位总涨跌幅为 46.2%，中位年化波动为 27.0%，自适应反转阈值折算比例中位数为 3.40%。</w:t>
+      </w:r>
+    </w:p>
+    <w:p>
+      <w:r>
+        <w:t>波段结构上，上涨波段占比 49.9%，波段持续天数中位数 10.0 天，评分中位数 64.2。最高质量样本来自 食品饮料，历史最高波段评分 86.9；年化波段最密集的是 医药生物，约 20.1 段/年。</w:t>
+      </w:r>
+    </w:p>
+    <w:p>
+      <w:r>
+        <w:t>评分驱动上，该组内部最靠前的解释变量是 回撤控制分（0.71）、稳定性分（0.66）。这能帮助判断该资产组的高分来自顺滑推进、回撤控制，还是来自更强的单段涨跌幅。</w:t>
+      </w:r>
+    </w:p>
+    <w:p>
+      <w:r>
+        <w:t>当前约 120 个交易日区间内，组内连续性最强的是 CPO概念（上涨，区间评分 85.0，方向一致性 0.57）；连续性较弱的是 房地产（区间评分 20.2）。</w:t>
+      </w:r>
+    </w:p>
+    <w:p>
+      <w:r>
+        <w:t>板块章节的重点是观察主题扩散和风险偏好。板块更容易出现高强度波段，也更容易因为资金切换出现尖锐回撤，因此评分时尤其需要看回撤控制和方向一致性，不能只看区间涨幅。</w:t>
+      </w:r>
+    </w:p>
+    <w:p>
+      <w:pPr>
+        <w:pStyle w:val="Heading2"/>
+      </w:pPr>
+      <w:r>
+        <w:t>商品样本分析</w:t>
+      </w:r>
+    </w:p>
+    <w:p>
+      <w:r>
+        <w:t>覆盖 4 个品种、6,219 行日线数据，识别 367 个波段。该组中位总涨跌幅为 101.8%，中位年化波动为 30.4%，自适应反转阈值折算比例中位数为 3.83%。</w:t>
+      </w:r>
+    </w:p>
+    <w:p>
+      <w:r>
+        <w:t>波段结构上，上涨波段占比 50.1%，波段持续天数中位数 11.0 天，评分中位数 63.1。最高质量样本来自 螺纹钢连续，历史最高波段评分 89.2；年化波段最密集的是 螺纹钢连续，约 17.5 段/年。</w:t>
+      </w:r>
+    </w:p>
+    <w:p>
+      <w:r>
+        <w:t>评分驱动上，该组内部最靠前的解释变量是 回撤控制分（0.67）、稳定性分（0.64）。这能帮助判断该资产组的高分来自顺滑推进、回撤控制，还是来自更强的单段涨跌幅。</w:t>
+      </w:r>
+    </w:p>
+    <w:p>
+      <w:r>
+        <w:t>当前约 120 个交易日区间内，组内连续性最强的是 原油连续（上涨，区间评分 60.9，方向一致性 0.52）；连续性较弱的是 螺纹钢连续（区间评分 30.2）。</w:t>
+      </w:r>
+    </w:p>
+    <w:p>
+      <w:r>
+        <w:t>商品章节的重点是处理不同合约价格量级和波动结构。商品趋势有时更顺，但点数不可直接跨品种比较，因此百分比阈值、日波动倍数和同品种历史分位比绝对点数更重要。</w:t>
       </w:r>
     </w:p>
     <w:p>

</xml_diff>